<commit_message>
fix(proposal): add missing Division of Work section, fix ambiguous role labels
Division of Work was dropped when PROPOSAL_DRAFT.md was deleted in favor of
the docx. Added it back with the actual team members named, and corrected
the Weekly schedule table which used unlabeled "Person A/Person B" columns
that didn't even consistently track the same person across rows. Both
sections now reflect what git history shows each member actually did.
</commit_message>
<xml_diff>
--- a/CSC14116 - Proposal.docx
+++ b/CSC14116 - Proposal.docx
@@ -4325,6 +4325,129 @@
               <w:jc w:val="both"/>
               <w:rPr>
                 <w:rFonts w:ascii="Cambria" w:hAnsi="Cambria" w:cs="Times New Roman"/>
+                <w:sz w:val="24"/>
+                <w:szCs w:val="24"/>
+              </w:rPr>
+            </w:pPr>
+            <w:r>
+              <w:rPr>
+                <w:rFonts w:ascii="Cambria" w:hAnsi="Cambria" w:cs="Times New Roman"/>
+                <w:b/>
+                <w:sz w:val="24"/>
+                <w:szCs w:val="24"/>
+              </w:rPr>
+              <w:t xml:space="preserve">Division of Work</w:t>
+            </w:r>
+          </w:p>
+          <w:p>
+            <w:pPr>
+              <w:spacing w:line="360" w:lineRule="auto"/>
+              <w:jc w:val="both"/>
+              <w:rPr>
+                <w:rFonts w:ascii="Cambria" w:hAnsi="Cambria" w:cs="Times New Roman"/>
+                <w:sz w:val="24"/>
+                <w:szCs w:val="24"/>
+              </w:rPr>
+            </w:pPr>
+            <w:r>
+              <w:rPr>
+                <w:rFonts w:ascii="Cambria" w:hAnsi="Cambria" w:cs="Times New Roman"/>
+                <w:b/>
+                <w:sz w:val="24"/>
+                <w:szCs w:val="24"/>
+              </w:rPr>
+              <w:t xml:space="preserve">Phung Quoc Tuan (19127616) — </w:t>
+            </w:r>
+            <w:r>
+              <w:rPr>
+                <w:rFonts w:ascii="Cambria" w:hAnsi="Cambria" w:cs="Times New Roman"/>
+                <w:sz w:val="24"/>
+                <w:szCs w:val="24"/>
+              </w:rPr>
+              <w:t xml:space="preserve">set up the Git repository, implemented the CPU baseline (src/cpu_baseline.py and the accompanying notebook) and its initial correctness test suite, and authored the proposal draft (problem statement, background, challenge, optimization plan, risk analysis).</w:t>
+            </w:r>
+          </w:p>
+          <w:p>
+            <w:pPr>
+              <w:spacing w:line="360" w:lineRule="auto"/>
+              <w:jc w:val="both"/>
+              <w:rPr>
+                <w:rFonts w:ascii="Cambria" w:hAnsi="Cambria" w:cs="Times New Roman"/>
+                <w:sz w:val="24"/>
+                <w:szCs w:val="24"/>
+              </w:rPr>
+            </w:pPr>
+            <w:r>
+              <w:rPr>
+                <w:rFonts w:ascii="Cambria" w:hAnsi="Cambria" w:cs="Times New Roman"/>
+                <w:b/>
+                <w:sz w:val="24"/>
+                <w:szCs w:val="24"/>
+              </w:rPr>
+              <w:t xml:space="preserve">Le Quang Tan (22127378) — </w:t>
+            </w:r>
+            <w:r>
+              <w:rPr>
+                <w:rFonts w:ascii="Cambria" w:hAnsi="Cambria" w:cs="Times New Roman"/>
+                <w:sz w:val="24"/>
+                <w:szCs w:val="24"/>
+              </w:rPr>
+              <w:t xml:space="preserve">implemented the GPU side: the naive parallel IoU-matrix kernel (src/gpu_v1.py), the fix that replaced the nested Python suppression loop with a vectorized NumPy version, the GPU-specific additions to the correctness test suite (tests/test_correctness.py), and finalized/formatted the submitted proposal document.</w:t>
+            </w:r>
+          </w:p>
+          <w:p>
+            <w:pPr>
+              <w:spacing w:line="360" w:lineRule="auto"/>
+              <w:jc w:val="both"/>
+              <w:rPr>
+                <w:rFonts w:ascii="Cambria" w:hAnsi="Cambria" w:cs="Times New Roman"/>
+                <w:sz w:val="24"/>
+                <w:szCs w:val="24"/>
+              </w:rPr>
+            </w:pPr>
+            <w:r>
+              <w:rPr>
+                <w:rFonts w:ascii="Cambria" w:hAnsi="Cambria" w:cs="Times New Roman"/>
+                <w:sz w:val="24"/>
+                <w:szCs w:val="24"/>
+              </w:rPr>
+              <w:t xml:space="preserve">Both members are expected to be able to explain every part of the code, per the course's participation requirement.</w:t>
+            </w:r>
+          </w:p>
+        </w:tc>
+      </w:tr>
+    </w:tbl>
+    <w:p>
+      <w:pPr>
+        <w:spacing w:after="0" w:line="360" w:lineRule="auto"/>
+        <w:jc w:val="both"/>
+        <w:rPr>
+          <w:rFonts w:ascii="Cambria" w:hAnsi="Cambria" w:cs="Times New Roman"/>
+          <w:b/>
+          <w:sz w:val="12"/>
+        </w:rPr>
+      </w:pPr>
+    </w:p>
+    <w:tbl>
+      <w:tblPr>
+        <w:tblStyle w:val="TableGrid"/>
+        <w:tblW w:w="0" w:type="auto"/>
+        <w:tblLook w:val="04A0" w:firstRow="1" w:lastRow="0" w:firstColumn="1" w:lastColumn="0" w:noHBand="0" w:noVBand="1"/>
+      </w:tblPr>
+      <w:tblGrid>
+        <w:gridCol w:w="9350"/>
+      </w:tblGrid>
+      <w:tr>
+        <w:tc>
+          <w:tcPr>
+            <w:tcW w:w="9350" w:type="dxa"/>
+          </w:tcPr>
+          <w:p>
+            <w:pPr>
+              <w:spacing w:line="360" w:lineRule="auto"/>
+              <w:jc w:val="both"/>
+              <w:rPr>
+                <w:rFonts w:ascii="Cambria" w:hAnsi="Cambria" w:cs="Times New Roman"/>
                 <w:bCs/>
                 <w:sz w:val="24"/>
                 <w:szCs w:val="24"/>
@@ -4419,7 +4542,7 @@
                       <w:sz w:val="24"/>
                       <w:szCs w:val="24"/>
                     </w:rPr>
-                    <w:t>Week</w:t>
+                    <w:t xml:space="preserve">Week</w:t>
                   </w:r>
                 </w:p>
               </w:tc>
@@ -4445,7 +4568,7 @@
                       <w:sz w:val="24"/>
                       <w:szCs w:val="24"/>
                     </w:rPr>
-                    <w:t>Person A</w:t>
+                    <w:t xml:space="preserve">Phung Quoc Tuan</w:t>
                   </w:r>
                 </w:p>
               </w:tc>
@@ -4471,7 +4594,7 @@
                       <w:sz w:val="24"/>
                       <w:szCs w:val="24"/>
                     </w:rPr>
-                    <w:t>Person B</w:t>
+                    <w:t xml:space="preserve">Le Quang Tan</w:t>
                   </w:r>
                 </w:p>
               </w:tc>
@@ -4484,7 +4607,7 @@
                 <w:p>
                   <w:pPr>
                     <w:spacing w:line="360" w:lineRule="auto"/>
-                    <w:jc w:val="both"/>
+                    <w:jc w:val="center"/>
                     <w:rPr>
                       <w:rFonts w:ascii="Cambria" w:hAnsi="Cambria" w:cs="Times New Roman"/>
                       <w:bCs/>
@@ -4499,7 +4622,7 @@
                       <w:sz w:val="24"/>
                       <w:szCs w:val="24"/>
                     </w:rPr>
-                    <w:t>5–6</w:t>
+                    <w:t xml:space="preserve">5–6</w:t>
                   </w:r>
                 </w:p>
               </w:tc>
@@ -4525,7 +4648,7 @@
                       <w:sz w:val="24"/>
                       <w:szCs w:val="24"/>
                     </w:rPr>
-                    <w:t>CPU baseline + profiling</w:t>
+                    <w:t xml:space="preserve">Git repo setup, CPU baseline + profiling, wrote the proposal draft</w:t>
                   </w:r>
                 </w:p>
               </w:tc>
@@ -4551,7 +4674,7 @@
                       <w:sz w:val="24"/>
                       <w:szCs w:val="24"/>
                     </w:rPr>
-                    <w:t>Write proposal + Git setup</w:t>
+                    <w:t xml:space="preserve">(not yet started as of this submission)</w:t>
                   </w:r>
                 </w:p>
               </w:tc>
@@ -4564,7 +4687,7 @@
                 <w:p>
                   <w:pPr>
                     <w:spacing w:line="360" w:lineRule="auto"/>
-                    <w:jc w:val="both"/>
+                    <w:jc w:val="center"/>
                     <w:rPr>
                       <w:rFonts w:ascii="Cambria" w:hAnsi="Cambria" w:cs="Times New Roman"/>
                       <w:bCs/>
@@ -4579,7 +4702,7 @@
                       <w:sz w:val="24"/>
                       <w:szCs w:val="24"/>
                     </w:rPr>
-                    <w:t>7</w:t>
+                    <w:t xml:space="preserve">7</w:t>
                   </w:r>
                 </w:p>
               </w:tc>
@@ -4605,7 +4728,7 @@
                       <w:sz w:val="24"/>
                       <w:szCs w:val="24"/>
                     </w:rPr>
-                    <w:t>GPU V1 (naive IoU kernel)</w:t>
+                    <w:t xml:space="preserve">Verified CPU baseline against the torchvision reference</w:t>
                   </w:r>
                 </w:p>
               </w:tc>
@@ -4631,7 +4754,7 @@
                       <w:sz w:val="24"/>
                       <w:szCs w:val="24"/>
                     </w:rPr>
-                    <w:t>Verify V1 vs. torchvision</w:t>
+                    <w:t xml:space="preserve">GPU V1: naive parallel IoU-matrix kernel, plus the fix replacing the nested Python suppression loop with vectorized NumPy; finalized the submitted proposal document</w:t>
                   </w:r>
                 </w:p>
               </w:tc>
@@ -4644,7 +4767,7 @@
                 <w:p>
                   <w:pPr>
                     <w:spacing w:line="360" w:lineRule="auto"/>
-                    <w:jc w:val="both"/>
+                    <w:jc w:val="center"/>
                     <w:rPr>
                       <w:rFonts w:ascii="Cambria" w:hAnsi="Cambria" w:cs="Times New Roman"/>
                       <w:bCs/>
@@ -4659,7 +4782,7 @@
                       <w:sz w:val="24"/>
                       <w:szCs w:val="24"/>
                     </w:rPr>
-                    <w:t>8</w:t>
+                    <w:t xml:space="preserve">8 (planned)</w:t>
                   </w:r>
                 </w:p>
               </w:tc>
@@ -4685,7 +4808,7 @@
                       <w:sz w:val="24"/>
                       <w:szCs w:val="24"/>
                     </w:rPr>
-                    <w:t>GPU V2 (memory optimization)</w:t>
+                    <w:t xml:space="preserve">Assist verification and write-up of GPU V2 results</w:t>
                   </w:r>
                 </w:p>
               </w:tc>
@@ -4711,7 +4834,7 @@
                       <w:sz w:val="24"/>
                       <w:szCs w:val="24"/>
                     </w:rPr>
-                    <w:t>GPU V3 (Matrix NMS)</w:t>
+                    <w:t xml:space="preserve">GPU V2: batched NMS with parallel reduction for the suppression mask</w:t>
                   </w:r>
                 </w:p>
               </w:tc>
@@ -4724,7 +4847,7 @@
                 <w:p>
                   <w:pPr>
                     <w:spacing w:line="360" w:lineRule="auto"/>
-                    <w:jc w:val="both"/>
+                    <w:jc w:val="center"/>
                     <w:rPr>
                       <w:rFonts w:ascii="Cambria" w:hAnsi="Cambria" w:cs="Times New Roman"/>
                       <w:bCs/>
@@ -4739,7 +4862,7 @@
                       <w:sz w:val="24"/>
                       <w:szCs w:val="24"/>
                     </w:rPr>
-                    <w:t>9–10</w:t>
+                    <w:t xml:space="preserve">9–10 (planned)</w:t>
                   </w:r>
                 </w:p>
               </w:tc>
@@ -4765,7 +4888,7 @@
                       <w:sz w:val="24"/>
                       <w:szCs w:val="24"/>
                     </w:rPr>
-                    <w:t>Combined benchmarking</w:t>
+                    <w:t xml:space="preserve">Report, slides, and demo</w:t>
                   </w:r>
                 </w:p>
               </w:tc>
@@ -4791,7 +4914,7 @@
                       <w:sz w:val="24"/>
                       <w:szCs w:val="24"/>
                     </w:rPr>
-                    <w:t>Report + slides + demo</w:t>
+                    <w:t xml:space="preserve">GPU V3: Matrix NMS, plus combined benchmarking across all versions</w:t>
                   </w:r>
                 </w:p>
               </w:tc>

</xml_diff>